<commit_message>
Add coursework reports and update CW1 docx
Update CW1/Report.docx and add corresponding CW1/Report.pdf. Add new CW2 documents: Pentesting Plan.docx and Report.docx. These are binary coursework submission files for CW1 and CW2.
</commit_message>
<xml_diff>
--- a/CW1/Report.docx
+++ b/CW1/Report.docx
@@ -2,48 +2,1003 @@
 <file path=word/document.xml><?xml version="1.0" encoding="utf-8"?>
 <w:document xmlns:wpc="http://schemas.microsoft.com/office/word/2010/wordprocessingCanvas" xmlns:cx="http://schemas.microsoft.com/office/drawing/2014/chartex" xmlns:cx1="http://schemas.microsoft.com/office/drawing/2015/9/8/chartex" xmlns:cx2="http://schemas.microsoft.com/office/drawing/2015/10/21/chartex" xmlns:cx3="http://schemas.microsoft.com/office/drawing/2016/5/9/chartex" xmlns:cx4="http://schemas.microsoft.com/office/drawing/2016/5/10/chartex" xmlns:cx5="http://schemas.microsoft.com/office/drawing/2016/5/11/chartex" xmlns:cx6="http://schemas.microsoft.com/office/drawing/2016/5/12/chartex" xmlns:cx7="http://schemas.microsoft.com/office/drawing/2016/5/13/chartex" xmlns:cx8="http://schemas.microsoft.com/office/drawing/2016/5/14/chartex" xmlns:mc="http://schemas.openxmlformats.org/markup-compatibility/2006" xmlns:aink="http://schemas.microsoft.com/office/drawing/2016/ink" xmlns:am3d="http://schemas.microsoft.com/office/drawing/2017/model3d" xmlns:o="urn:schemas-microsoft-com:office:office" xmlns:oel="http://schemas.microsoft.com/office/2019/extlst" xmlns:r="http://schemas.openxmlformats.org/officeDocument/2006/relationships" xmlns:m="http://schemas.openxmlformats.org/officeDocument/2006/math" xmlns:v="urn:schemas-microsoft-com:vml" xmlns:wp14="http://schemas.microsoft.com/office/word/2010/wordprocessingDrawing" xmlns:wp="http://schemas.openxmlformats.org/drawingml/2006/wordprocessingDrawing" xmlns:w10="urn:schemas-microsoft-com:office:word" xmlns:w="http://schemas.openxmlformats.org/wordprocessingml/2006/main" xmlns:w14="http://schemas.microsoft.com/office/word/2010/wordml" xmlns:w15="http://schemas.microsoft.com/office/word/2012/wordml" xmlns:w16cex="http://schemas.microsoft.com/office/word/2018/wordml/cex" xmlns:w16cid="http://schemas.microsoft.com/office/word/2016/wordml/cid" xmlns:w16="http://schemas.microsoft.com/office/word/2018/wordml" xmlns:w16du="http://schemas.microsoft.com/office/word/2023/wordml/word16du" xmlns:w16sdtdh="http://schemas.microsoft.com/office/word/2020/wordml/sdtdatahash" xmlns:w16sdtfl="http://schemas.microsoft.com/office/word/2024/wordml/sdtformatlock" xmlns:w16se="http://schemas.microsoft.com/office/word/2015/wordml/symex" xmlns:wpg="http://schemas.microsoft.com/office/word/2010/wordprocessingGroup" xmlns:wpi="http://schemas.microsoft.com/office/word/2010/wordprocessingInk" xmlns:wne="http://schemas.microsoft.com/office/word/2006/wordml" xmlns:wps="http://schemas.microsoft.com/office/word/2010/wordprocessingShape" mc:Ignorable="w14 w15 w16se w16cid w16 w16cex w16sdtdh w16sdtfl w16du wp14">
   <w:body>
-    <w:p>
-      <w:pPr>
-        <w:pStyle w:val="Title"/>
-        <w:jc w:val="center"/>
-        <w:rPr>
-          <w:b/>
-          <w:bCs/>
-          <w:u w:val="single"/>
-        </w:rPr>
-      </w:pPr>
-      <w:r>
-        <w:rPr>
-          <w:b/>
-          <w:bCs/>
-          <w:u w:val="single"/>
-        </w:rPr>
-        <w:t>Threat Analysis and OSINT</w:t>
-      </w:r>
-      <w:r>
-        <w:rPr>
-          <w:b/>
-          <w:bCs/>
-          <w:u w:val="single"/>
-        </w:rPr>
-        <w:t xml:space="preserve"> </w:t>
-      </w:r>
-      <w:r>
-        <w:rPr>
-          <w:b/>
-          <w:bCs/>
-          <w:u w:val="single"/>
-        </w:rPr>
-        <w:t>Report</w:t>
-      </w:r>
-    </w:p>
+    <w:sdt>
+      <w:sdtPr>
+        <w:id w:val="435256096"/>
+        <w:docPartObj>
+          <w:docPartGallery w:val="Cover Pages"/>
+          <w:docPartUnique/>
+        </w:docPartObj>
+      </w:sdtPr>
+      <w:sdtContent>
+        <w:p>
+          <w:r>
+            <w:rPr>
+              <w:noProof/>
+            </w:rPr>
+            <mc:AlternateContent>
+              <mc:Choice Requires="wpg">
+                <w:drawing>
+                  <wp:anchor distT="0" distB="0" distL="114300" distR="114300" simplePos="0" relativeHeight="251659264" behindDoc="1" locked="0" layoutInCell="1" allowOverlap="1" wp14:anchorId="2E970EC2" wp14:editId="741DEC22">
+                    <wp:simplePos x="0" y="0"/>
+                    <wp:positionH relativeFrom="page">
+                      <wp:align>center</wp:align>
+                    </wp:positionH>
+                    <wp:positionV relativeFrom="page">
+                      <wp:align>center</wp:align>
+                    </wp:positionV>
+                    <wp:extent cx="6864824" cy="9123528"/>
+                    <wp:effectExtent l="0" t="0" r="2540" b="635"/>
+                    <wp:wrapNone/>
+                    <wp:docPr id="193" name="Group 198"/>
+                    <wp:cNvGraphicFramePr/>
+                    <a:graphic xmlns:a="http://schemas.openxmlformats.org/drawingml/2006/main">
+                      <a:graphicData uri="http://schemas.microsoft.com/office/word/2010/wordprocessingGroup">
+                        <wpg:wgp>
+                          <wpg:cNvGrpSpPr/>
+                          <wpg:grpSpPr>
+                            <a:xfrm>
+                              <a:off x="0" y="0"/>
+                              <a:ext cx="6864824" cy="9123528"/>
+                              <a:chOff x="0" y="0"/>
+                              <a:chExt cx="6864824" cy="9123528"/>
+                            </a:xfrm>
+                          </wpg:grpSpPr>
+                          <wps:wsp>
+                            <wps:cNvPr id="194" name="Rectangle 194"/>
+                            <wps:cNvSpPr/>
+                            <wps:spPr>
+                              <a:xfrm>
+                                <a:off x="0" y="0"/>
+                                <a:ext cx="6858000" cy="1371600"/>
+                              </a:xfrm>
+                              <a:prstGeom prst="rect">
+                                <a:avLst/>
+                              </a:prstGeom>
+                              <a:solidFill>
+                                <a:schemeClr val="accent1"/>
+                              </a:solidFill>
+                              <a:ln>
+                                <a:noFill/>
+                              </a:ln>
+                            </wps:spPr>
+                            <wps:style>
+                              <a:lnRef idx="2">
+                                <a:schemeClr val="accent1">
+                                  <a:shade val="50000"/>
+                                </a:schemeClr>
+                              </a:lnRef>
+                              <a:fillRef idx="1">
+                                <a:schemeClr val="accent1"/>
+                              </a:fillRef>
+                              <a:effectRef idx="0">
+                                <a:schemeClr val="accent1"/>
+                              </a:effectRef>
+                              <a:fontRef idx="minor">
+                                <a:schemeClr val="lt1"/>
+                              </a:fontRef>
+                            </wps:style>
+                            <wps:bodyPr rot="0" spcFirstLastPara="0" vertOverflow="overflow" horzOverflow="overflow" vert="horz" wrap="square" lIns="91440" tIns="45720" rIns="91440" bIns="45720" numCol="1" spcCol="0" rtlCol="0" fromWordArt="0" anchor="ctr" anchorCtr="0" forceAA="0" compatLnSpc="1">
+                              <a:prstTxWarp prst="textNoShape">
+                                <a:avLst/>
+                              </a:prstTxWarp>
+                              <a:noAutofit/>
+                            </wps:bodyPr>
+                          </wps:wsp>
+                          <wps:wsp>
+                            <wps:cNvPr id="195" name="Rectangle 195"/>
+                            <wps:cNvSpPr/>
+                            <wps:spPr>
+                              <a:xfrm>
+                                <a:off x="0" y="4094328"/>
+                                <a:ext cx="6858000" cy="5029200"/>
+                              </a:xfrm>
+                              <a:prstGeom prst="rect">
+                                <a:avLst/>
+                              </a:prstGeom>
+                              <a:solidFill>
+                                <a:schemeClr val="accent1"/>
+                              </a:solidFill>
+                              <a:ln>
+                                <a:noFill/>
+                              </a:ln>
+                            </wps:spPr>
+                            <wps:style>
+                              <a:lnRef idx="2">
+                                <a:schemeClr val="accent1">
+                                  <a:shade val="50000"/>
+                                </a:schemeClr>
+                              </a:lnRef>
+                              <a:fillRef idx="1">
+                                <a:schemeClr val="accent1"/>
+                              </a:fillRef>
+                              <a:effectRef idx="0">
+                                <a:schemeClr val="accent1"/>
+                              </a:effectRef>
+                              <a:fontRef idx="minor">
+                                <a:schemeClr val="lt1"/>
+                              </a:fontRef>
+                            </wps:style>
+                            <wps:txbx>
+                              <w:txbxContent>
+                                <w:sdt>
+                                  <w:sdtPr>
+                                    <w:rPr>
+                                      <w:color w:val="FFFFFF" w:themeColor="background1"/>
+                                    </w:rPr>
+                                    <w:alias w:val="Author"/>
+                                    <w:tag w:val=""/>
+                                    <w:id w:val="945428907"/>
+                                    <w:dataBinding w:prefixMappings="xmlns:ns0='http://purl.org/dc/elements/1.1/' xmlns:ns1='http://schemas.openxmlformats.org/package/2006/metadata/core-properties' " w:xpath="/ns1:coreProperties[1]/ns0:creator[1]" w:storeItemID="{6C3C8BC8-F283-45AE-878A-BAB7291924A1}"/>
+                                    <w:text/>
+                                  </w:sdtPr>
+                                  <w:sdtContent>
+                                    <w:p>
+                                      <w:pPr>
+                                        <w:pStyle w:val="NoSpacing"/>
+                                        <w:spacing w:before="120"/>
+                                        <w:jc w:val="center"/>
+                                        <w:rPr>
+                                          <w:color w:val="FFFFFF" w:themeColor="background1"/>
+                                        </w:rPr>
+                                      </w:pPr>
+                                      <w:r>
+                                        <w:rPr>
+                                          <w:color w:val="FFFFFF" w:themeColor="background1"/>
+                                        </w:rPr>
+                                        <w:t>matthew fish</w:t>
+                                      </w:r>
+                                    </w:p>
+                                  </w:sdtContent>
+                                </w:sdt>
+                                <w:p>
+                                  <w:pPr>
+                                    <w:pStyle w:val="NoSpacing"/>
+                                    <w:spacing w:before="120"/>
+                                    <w:jc w:val="center"/>
+                                    <w:rPr>
+                                      <w:color w:val="FFFFFF" w:themeColor="background1"/>
+                                    </w:rPr>
+                                  </w:pPr>
+                                  <w:sdt>
+                                    <w:sdtPr>
+                                      <w:rPr>
+                                        <w:caps/>
+                                        <w:color w:val="FFFFFF" w:themeColor="background1"/>
+                                      </w:rPr>
+                                      <w:alias w:val="Company"/>
+                                      <w:tag w:val=""/>
+                                      <w:id w:val="1618182777"/>
+                                      <w:showingPlcHdr/>
+                                      <w:dataBinding w:prefixMappings="xmlns:ns0='http://schemas.openxmlformats.org/officeDocument/2006/extended-properties' " w:xpath="/ns0:Properties[1]/ns0:Company[1]" w:storeItemID="{6668398D-A668-4E3E-A5EB-62B293D839F1}"/>
+                                      <w:text/>
+                                    </w:sdtPr>
+                                    <w:sdtContent>
+                                      <w:r>
+                                        <w:rPr>
+                                          <w:caps/>
+                                          <w:color w:val="FFFFFF" w:themeColor="background1"/>
+                                        </w:rPr>
+                                        <w:t xml:space="preserve">     </w:t>
+                                      </w:r>
+                                    </w:sdtContent>
+                                  </w:sdt>
+                                  <w:r>
+                                    <w:rPr>
+                                      <w:color w:val="FFFFFF" w:themeColor="background1"/>
+                                    </w:rPr>
+                                    <w:t>  </w:t>
+                                  </w:r>
+                                  <w:sdt>
+                                    <w:sdtPr>
+                                      <w:rPr>
+                                        <w:color w:val="FFFFFF" w:themeColor="background1"/>
+                                      </w:rPr>
+                                      <w:alias w:val="Address"/>
+                                      <w:tag w:val=""/>
+                                      <w:id w:val="-253358678"/>
+                                      <w:showingPlcHdr/>
+                                      <w:dataBinding w:prefixMappings="xmlns:ns0='http://schemas.microsoft.com/office/2006/coverPageProps' " w:xpath="/ns0:CoverPageProperties[1]/ns0:CompanyAddress[1]" w:storeItemID="{55AF091B-3C7A-41E3-B477-F2FDAA23CFDA}"/>
+                                      <w:text/>
+                                    </w:sdtPr>
+                                    <w:sdtContent>
+                                      <w:r>
+                                        <w:rPr>
+                                          <w:color w:val="FFFFFF" w:themeColor="background1"/>
+                                        </w:rPr>
+                                        <w:t xml:space="preserve">     </w:t>
+                                      </w:r>
+                                    </w:sdtContent>
+                                  </w:sdt>
+                                </w:p>
+                              </w:txbxContent>
+                            </wps:txbx>
+                            <wps:bodyPr rot="0" spcFirstLastPara="0" vertOverflow="overflow" horzOverflow="overflow" vert="horz" wrap="square" lIns="457200" tIns="731520" rIns="457200" bIns="457200" numCol="1" spcCol="0" rtlCol="0" fromWordArt="0" anchor="b" anchorCtr="0" forceAA="0" compatLnSpc="1">
+                              <a:prstTxWarp prst="textNoShape">
+                                <a:avLst/>
+                              </a:prstTxWarp>
+                              <a:noAutofit/>
+                            </wps:bodyPr>
+                          </wps:wsp>
+                          <wps:wsp>
+                            <wps:cNvPr id="196" name="Text Box 196"/>
+                            <wps:cNvSpPr txBox="1"/>
+                            <wps:spPr>
+                              <a:xfrm>
+                                <a:off x="6824" y="1371600"/>
+                                <a:ext cx="6858000" cy="2722728"/>
+                              </a:xfrm>
+                              <a:prstGeom prst="rect">
+                                <a:avLst/>
+                              </a:prstGeom>
+                              <a:solidFill>
+                                <a:schemeClr val="bg1"/>
+                              </a:solidFill>
+                              <a:ln w="6350">
+                                <a:noFill/>
+                              </a:ln>
+                              <a:effectLst/>
+                            </wps:spPr>
+                            <wps:style>
+                              <a:lnRef idx="0">
+                                <a:schemeClr val="accent1"/>
+                              </a:lnRef>
+                              <a:fillRef idx="0">
+                                <a:schemeClr val="accent1"/>
+                              </a:fillRef>
+                              <a:effectRef idx="0">
+                                <a:schemeClr val="accent1"/>
+                              </a:effectRef>
+                              <a:fontRef idx="minor">
+                                <a:schemeClr val="dk1"/>
+                              </a:fontRef>
+                            </wps:style>
+                            <wps:txbx>
+                              <w:txbxContent>
+                                <w:sdt>
+                                  <w:sdtPr>
+                                    <w:rPr>
+                                      <w:sz w:val="96"/>
+                                      <w:szCs w:val="96"/>
+                                    </w:rPr>
+                                    <w:alias w:val="Title"/>
+                                    <w:tag w:val=""/>
+                                    <w:id w:val="-9991715"/>
+                                    <w:dataBinding w:prefixMappings="xmlns:ns0='http://purl.org/dc/elements/1.1/' xmlns:ns1='http://schemas.openxmlformats.org/package/2006/metadata/core-properties' " w:xpath="/ns1:coreProperties[1]/ns0:title[1]" w:storeItemID="{6C3C8BC8-F283-45AE-878A-BAB7291924A1}"/>
+                                    <w:text/>
+                                  </w:sdtPr>
+                                  <w:sdtContent>
+                                    <w:p>
+                                      <w:pPr>
+                                        <w:pStyle w:val="Title"/>
+                                        <w:jc w:val="center"/>
+                                        <w:rPr>
+                                          <w:sz w:val="96"/>
+                                          <w:szCs w:val="96"/>
+                                        </w:rPr>
+                                      </w:pPr>
+                                      <w:r>
+                                        <w:rPr>
+                                          <w:sz w:val="96"/>
+                                          <w:szCs w:val="96"/>
+                                        </w:rPr>
+                                        <w:t>Threat Analysis and OSINT Report</w:t>
+                                      </w:r>
+                                    </w:p>
+                                  </w:sdtContent>
+                                </w:sdt>
+                              </w:txbxContent>
+                            </wps:txbx>
+                            <wps:bodyPr rot="0" spcFirstLastPara="0" vertOverflow="overflow" horzOverflow="overflow" vert="horz" wrap="square" lIns="457200" tIns="91440" rIns="457200" bIns="91440" numCol="1" spcCol="0" rtlCol="0" fromWordArt="0" anchor="ctr" anchorCtr="0" forceAA="0" compatLnSpc="1">
+                              <a:prstTxWarp prst="textNoShape">
+                                <a:avLst/>
+                              </a:prstTxWarp>
+                              <a:noAutofit/>
+                            </wps:bodyPr>
+                          </wps:wsp>
+                        </wpg:wgp>
+                      </a:graphicData>
+                    </a:graphic>
+                    <wp14:sizeRelH relativeFrom="page">
+                      <wp14:pctWidth>88200</wp14:pctWidth>
+                    </wp14:sizeRelH>
+                    <wp14:sizeRelV relativeFrom="page">
+                      <wp14:pctHeight>90900</wp14:pctHeight>
+                    </wp14:sizeRelV>
+                  </wp:anchor>
+                </w:drawing>
+              </mc:Choice>
+              <mc:Fallback>
+                <w:pict>
+                  <v:group w14:anchorId="2E970EC2" id="Group 198" o:spid="_x0000_s1026" style="position:absolute;margin-left:0;margin-top:0;width:540.55pt;height:718.4pt;z-index:-251657216;mso-width-percent:882;mso-height-percent:909;mso-position-horizontal:center;mso-position-horizontal-relative:page;mso-position-vertical:center;mso-position-vertical-relative:page;mso-width-percent:882;mso-height-percent:909" coordsize="68648,91235" o:gfxdata="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">
+                    <v:rect id="Rectangle 194" o:spid="_x0000_s1027" style="position:absolute;width:68580;height:13716;visibility:visible;mso-wrap-style:square;v-text-anchor:middle" o:gfxdata="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" fillcolor="#4472c4 [3204]" stroked="f" strokeweight="1pt"/>
+                    <v:rect id="Rectangle 195" o:spid="_x0000_s1028" style="position:absolute;top:40943;width:68580;height:50292;visibility:visible;mso-wrap-style:square;v-text-anchor:bottom" o:gfxdata="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" fillcolor="#4472c4 [3204]" stroked="f" strokeweight="1pt">
+                      <v:textbox inset="36pt,57.6pt,36pt,36pt">
+                        <w:txbxContent>
+                          <w:sdt>
+                            <w:sdtPr>
+                              <w:rPr>
+                                <w:color w:val="FFFFFF" w:themeColor="background1"/>
+                              </w:rPr>
+                              <w:alias w:val="Author"/>
+                              <w:tag w:val=""/>
+                              <w:id w:val="945428907"/>
+                              <w:dataBinding w:prefixMappings="xmlns:ns0='http://purl.org/dc/elements/1.1/' xmlns:ns1='http://schemas.openxmlformats.org/package/2006/metadata/core-properties' " w:xpath="/ns1:coreProperties[1]/ns0:creator[1]" w:storeItemID="{6C3C8BC8-F283-45AE-878A-BAB7291924A1}"/>
+                              <w:text/>
+                            </w:sdtPr>
+                            <w:sdtContent>
+                              <w:p>
+                                <w:pPr>
+                                  <w:pStyle w:val="NoSpacing"/>
+                                  <w:spacing w:before="120"/>
+                                  <w:jc w:val="center"/>
+                                  <w:rPr>
+                                    <w:color w:val="FFFFFF" w:themeColor="background1"/>
+                                  </w:rPr>
+                                </w:pPr>
+                                <w:r>
+                                  <w:rPr>
+                                    <w:color w:val="FFFFFF" w:themeColor="background1"/>
+                                  </w:rPr>
+                                  <w:t>matthew fish</w:t>
+                                </w:r>
+                              </w:p>
+                            </w:sdtContent>
+                          </w:sdt>
+                          <w:p>
+                            <w:pPr>
+                              <w:pStyle w:val="NoSpacing"/>
+                              <w:spacing w:before="120"/>
+                              <w:jc w:val="center"/>
+                              <w:rPr>
+                                <w:color w:val="FFFFFF" w:themeColor="background1"/>
+                              </w:rPr>
+                            </w:pPr>
+                            <w:sdt>
+                              <w:sdtPr>
+                                <w:rPr>
+                                  <w:caps/>
+                                  <w:color w:val="FFFFFF" w:themeColor="background1"/>
+                                </w:rPr>
+                                <w:alias w:val="Company"/>
+                                <w:tag w:val=""/>
+                                <w:id w:val="1618182777"/>
+                                <w:showingPlcHdr/>
+                                <w:dataBinding w:prefixMappings="xmlns:ns0='http://schemas.openxmlformats.org/officeDocument/2006/extended-properties' " w:xpath="/ns0:Properties[1]/ns0:Company[1]" w:storeItemID="{6668398D-A668-4E3E-A5EB-62B293D839F1}"/>
+                                <w:text/>
+                              </w:sdtPr>
+                              <w:sdtContent>
+                                <w:r>
+                                  <w:rPr>
+                                    <w:caps/>
+                                    <w:color w:val="FFFFFF" w:themeColor="background1"/>
+                                  </w:rPr>
+                                  <w:t xml:space="preserve">     </w:t>
+                                </w:r>
+                              </w:sdtContent>
+                            </w:sdt>
+                            <w:r>
+                              <w:rPr>
+                                <w:color w:val="FFFFFF" w:themeColor="background1"/>
+                              </w:rPr>
+                              <w:t>  </w:t>
+                            </w:r>
+                            <w:sdt>
+                              <w:sdtPr>
+                                <w:rPr>
+                                  <w:color w:val="FFFFFF" w:themeColor="background1"/>
+                                </w:rPr>
+                                <w:alias w:val="Address"/>
+                                <w:tag w:val=""/>
+                                <w:id w:val="-253358678"/>
+                                <w:showingPlcHdr/>
+                                <w:dataBinding w:prefixMappings="xmlns:ns0='http://schemas.microsoft.com/office/2006/coverPageProps' " w:xpath="/ns0:CoverPageProperties[1]/ns0:CompanyAddress[1]" w:storeItemID="{55AF091B-3C7A-41E3-B477-F2FDAA23CFDA}"/>
+                                <w:text/>
+                              </w:sdtPr>
+                              <w:sdtContent>
+                                <w:r>
+                                  <w:rPr>
+                                    <w:color w:val="FFFFFF" w:themeColor="background1"/>
+                                  </w:rPr>
+                                  <w:t xml:space="preserve">     </w:t>
+                                </w:r>
+                              </w:sdtContent>
+                            </w:sdt>
+                          </w:p>
+                        </w:txbxContent>
+                      </v:textbox>
+                    </v:rect>
+                    <v:shapetype id="_x0000_t202" coordsize="21600,21600" o:spt="202" path="m,l,21600r21600,l21600,xe">
+                      <v:stroke joinstyle="miter"/>
+                      <v:path gradientshapeok="t" o:connecttype="rect"/>
+                    </v:shapetype>
+                    <v:shape id="Text Box 196" o:spid="_x0000_s1029" type="#_x0000_t202" style="position:absolute;left:68;top:13716;width:68580;height:27227;visibility:visible;mso-wrap-style:square;v-text-anchor:middle" o:gfxdata="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" fillcolor="white [3212]" stroked="f" strokeweight=".5pt">
+                      <v:textbox inset="36pt,7.2pt,36pt,7.2pt">
+                        <w:txbxContent>
+                          <w:sdt>
+                            <w:sdtPr>
+                              <w:rPr>
+                                <w:sz w:val="96"/>
+                                <w:szCs w:val="96"/>
+                              </w:rPr>
+                              <w:alias w:val="Title"/>
+                              <w:tag w:val=""/>
+                              <w:id w:val="-9991715"/>
+                              <w:dataBinding w:prefixMappings="xmlns:ns0='http://purl.org/dc/elements/1.1/' xmlns:ns1='http://schemas.openxmlformats.org/package/2006/metadata/core-properties' " w:xpath="/ns1:coreProperties[1]/ns0:title[1]" w:storeItemID="{6C3C8BC8-F283-45AE-878A-BAB7291924A1}"/>
+                              <w:text/>
+                            </w:sdtPr>
+                            <w:sdtContent>
+                              <w:p>
+                                <w:pPr>
+                                  <w:pStyle w:val="Title"/>
+                                  <w:jc w:val="center"/>
+                                  <w:rPr>
+                                    <w:sz w:val="96"/>
+                                    <w:szCs w:val="96"/>
+                                  </w:rPr>
+                                </w:pPr>
+                                <w:r>
+                                  <w:rPr>
+                                    <w:sz w:val="96"/>
+                                    <w:szCs w:val="96"/>
+                                  </w:rPr>
+                                  <w:t>Threat Analysis and OSINT Report</w:t>
+                                </w:r>
+                              </w:p>
+                            </w:sdtContent>
+                          </w:sdt>
+                        </w:txbxContent>
+                      </v:textbox>
+                    </v:shape>
+                    <w10:wrap anchorx="page" anchory="page"/>
+                  </v:group>
+                </w:pict>
+              </mc:Fallback>
+            </mc:AlternateContent>
+          </w:r>
+        </w:p>
+        <w:p>
+          <w:r>
+            <w:br w:type="page"/>
+          </w:r>
+        </w:p>
+      </w:sdtContent>
+    </w:sdt>
+    <w:sdt>
+      <w:sdtPr>
+        <w:id w:val="697739528"/>
+        <w:docPartObj>
+          <w:docPartGallery w:val="Table of Contents"/>
+          <w:docPartUnique/>
+        </w:docPartObj>
+      </w:sdtPr>
+      <w:sdtEndPr>
+        <w:rPr>
+          <w:rFonts w:asciiTheme="minorHAnsi" w:eastAsiaTheme="minorHAnsi" w:hAnsiTheme="minorHAnsi" w:cstheme="minorBidi"/>
+          <w:b/>
+          <w:bCs/>
+          <w:noProof/>
+          <w:color w:val="auto"/>
+          <w:sz w:val="22"/>
+          <w:szCs w:val="22"/>
+          <w:lang w:val="en-GB"/>
+        </w:rPr>
+      </w:sdtEndPr>
+      <w:sdtContent>
+        <w:p>
+          <w:pPr>
+            <w:pStyle w:val="TOCHeading"/>
+          </w:pPr>
+          <w:r>
+            <w:t>Contents</w:t>
+          </w:r>
+        </w:p>
+        <w:p>
+          <w:pPr>
+            <w:pStyle w:val="TOC1"/>
+            <w:tabs>
+              <w:tab w:val="right" w:leader="dot" w:pos="9016"/>
+            </w:tabs>
+            <w:rPr>
+              <w:noProof/>
+            </w:rPr>
+          </w:pPr>
+          <w:r>
+            <w:fldChar w:fldCharType="begin"/>
+          </w:r>
+          <w:r>
+            <w:instrText xml:space="preserve"> TOC \o "1-3" \h \z \u </w:instrText>
+          </w:r>
+          <w:r>
+            <w:fldChar w:fldCharType="separate"/>
+          </w:r>
+          <w:hyperlink w:anchor="_Toc222991508" w:history="1">
+            <w:r>
+              <w:rPr>
+                <w:rStyle w:val="Hyperlink"/>
+                <w:noProof/>
+              </w:rPr>
+              <w:t>Introduction</w:t>
+            </w:r>
+            <w:r>
+              <w:rPr>
+                <w:noProof/>
+                <w:webHidden/>
+              </w:rPr>
+              <w:tab/>
+            </w:r>
+            <w:r>
+              <w:rPr>
+                <w:noProof/>
+                <w:webHidden/>
+              </w:rPr>
+              <w:fldChar w:fldCharType="begin"/>
+            </w:r>
+            <w:r>
+              <w:rPr>
+                <w:noProof/>
+                <w:webHidden/>
+              </w:rPr>
+              <w:instrText xml:space="preserve"> PAGEREF _Toc222991508 \h </w:instrText>
+            </w:r>
+            <w:r>
+              <w:rPr>
+                <w:noProof/>
+                <w:webHidden/>
+              </w:rPr>
+            </w:r>
+            <w:r>
+              <w:rPr>
+                <w:noProof/>
+                <w:webHidden/>
+              </w:rPr>
+              <w:fldChar w:fldCharType="separate"/>
+            </w:r>
+            <w:r>
+              <w:rPr>
+                <w:noProof/>
+                <w:webHidden/>
+              </w:rPr>
+              <w:t>1</w:t>
+            </w:r>
+            <w:r>
+              <w:rPr>
+                <w:noProof/>
+                <w:webHidden/>
+              </w:rPr>
+              <w:fldChar w:fldCharType="end"/>
+            </w:r>
+          </w:hyperlink>
+        </w:p>
+        <w:p>
+          <w:pPr>
+            <w:pStyle w:val="TOC1"/>
+            <w:tabs>
+              <w:tab w:val="right" w:leader="dot" w:pos="9016"/>
+            </w:tabs>
+            <w:rPr>
+              <w:noProof/>
+            </w:rPr>
+          </w:pPr>
+          <w:hyperlink w:anchor="_Toc222991509" w:history="1">
+            <w:r>
+              <w:rPr>
+                <w:rStyle w:val="Hyperlink"/>
+                <w:noProof/>
+              </w:rPr>
+              <w:t>Cyber Threat Intelligence</w:t>
+            </w:r>
+            <w:r>
+              <w:rPr>
+                <w:noProof/>
+                <w:webHidden/>
+              </w:rPr>
+              <w:tab/>
+            </w:r>
+            <w:r>
+              <w:rPr>
+                <w:noProof/>
+                <w:webHidden/>
+              </w:rPr>
+              <w:fldChar w:fldCharType="begin"/>
+            </w:r>
+            <w:r>
+              <w:rPr>
+                <w:noProof/>
+                <w:webHidden/>
+              </w:rPr>
+              <w:instrText xml:space="preserve"> PAGEREF _Toc222991509 \h </w:instrText>
+            </w:r>
+            <w:r>
+              <w:rPr>
+                <w:noProof/>
+                <w:webHidden/>
+              </w:rPr>
+            </w:r>
+            <w:r>
+              <w:rPr>
+                <w:noProof/>
+                <w:webHidden/>
+              </w:rPr>
+              <w:fldChar w:fldCharType="separate"/>
+            </w:r>
+            <w:r>
+              <w:rPr>
+                <w:noProof/>
+                <w:webHidden/>
+              </w:rPr>
+              <w:t>1</w:t>
+            </w:r>
+            <w:r>
+              <w:rPr>
+                <w:noProof/>
+                <w:webHidden/>
+              </w:rPr>
+              <w:fldChar w:fldCharType="end"/>
+            </w:r>
+          </w:hyperlink>
+        </w:p>
+        <w:p>
+          <w:pPr>
+            <w:pStyle w:val="TOC1"/>
+            <w:tabs>
+              <w:tab w:val="right" w:leader="dot" w:pos="9016"/>
+            </w:tabs>
+            <w:rPr>
+              <w:noProof/>
+            </w:rPr>
+          </w:pPr>
+          <w:hyperlink w:anchor="_Toc222991510" w:history="1">
+            <w:r>
+              <w:rPr>
+                <w:rStyle w:val="Hyperlink"/>
+                <w:noProof/>
+              </w:rPr>
+              <w:t>OSINT Analysis</w:t>
+            </w:r>
+            <w:r>
+              <w:rPr>
+                <w:noProof/>
+                <w:webHidden/>
+              </w:rPr>
+              <w:tab/>
+            </w:r>
+            <w:r>
+              <w:rPr>
+                <w:noProof/>
+                <w:webHidden/>
+              </w:rPr>
+              <w:fldChar w:fldCharType="begin"/>
+            </w:r>
+            <w:r>
+              <w:rPr>
+                <w:noProof/>
+                <w:webHidden/>
+              </w:rPr>
+              <w:instrText xml:space="preserve"> PAGEREF _Toc222991510 \h </w:instrText>
+            </w:r>
+            <w:r>
+              <w:rPr>
+                <w:noProof/>
+                <w:webHidden/>
+              </w:rPr>
+            </w:r>
+            <w:r>
+              <w:rPr>
+                <w:noProof/>
+                <w:webHidden/>
+              </w:rPr>
+              <w:fldChar w:fldCharType="separate"/>
+            </w:r>
+            <w:r>
+              <w:rPr>
+                <w:noProof/>
+                <w:webHidden/>
+              </w:rPr>
+              <w:t>2</w:t>
+            </w:r>
+            <w:r>
+              <w:rPr>
+                <w:noProof/>
+                <w:webHidden/>
+              </w:rPr>
+              <w:fldChar w:fldCharType="end"/>
+            </w:r>
+          </w:hyperlink>
+        </w:p>
+        <w:p>
+          <w:pPr>
+            <w:pStyle w:val="TOC1"/>
+            <w:tabs>
+              <w:tab w:val="right" w:leader="dot" w:pos="9016"/>
+            </w:tabs>
+            <w:rPr>
+              <w:noProof/>
+            </w:rPr>
+          </w:pPr>
+          <w:hyperlink w:anchor="_Toc222991511" w:history="1">
+            <w:r>
+              <w:rPr>
+                <w:rStyle w:val="Hyperlink"/>
+                <w:noProof/>
+              </w:rPr>
+              <w:t>Discussion</w:t>
+            </w:r>
+            <w:r>
+              <w:rPr>
+                <w:noProof/>
+                <w:webHidden/>
+              </w:rPr>
+              <w:tab/>
+            </w:r>
+            <w:r>
+              <w:rPr>
+                <w:noProof/>
+                <w:webHidden/>
+              </w:rPr>
+              <w:fldChar w:fldCharType="begin"/>
+            </w:r>
+            <w:r>
+              <w:rPr>
+                <w:noProof/>
+                <w:webHidden/>
+              </w:rPr>
+              <w:instrText xml:space="preserve"> PAGEREF _Toc222991511 \h </w:instrText>
+            </w:r>
+            <w:r>
+              <w:rPr>
+                <w:noProof/>
+                <w:webHidden/>
+              </w:rPr>
+            </w:r>
+            <w:r>
+              <w:rPr>
+                <w:noProof/>
+                <w:webHidden/>
+              </w:rPr>
+              <w:fldChar w:fldCharType="separate"/>
+            </w:r>
+            <w:r>
+              <w:rPr>
+                <w:noProof/>
+                <w:webHidden/>
+              </w:rPr>
+              <w:t>3</w:t>
+            </w:r>
+            <w:r>
+              <w:rPr>
+                <w:noProof/>
+                <w:webHidden/>
+              </w:rPr>
+              <w:fldChar w:fldCharType="end"/>
+            </w:r>
+          </w:hyperlink>
+        </w:p>
+        <w:p>
+          <w:pPr>
+            <w:pStyle w:val="TOC1"/>
+            <w:tabs>
+              <w:tab w:val="right" w:leader="dot" w:pos="9016"/>
+            </w:tabs>
+            <w:rPr>
+              <w:noProof/>
+            </w:rPr>
+          </w:pPr>
+          <w:hyperlink w:anchor="_Toc222991512" w:history="1">
+            <w:r>
+              <w:rPr>
+                <w:rStyle w:val="Hyperlink"/>
+                <w:noProof/>
+              </w:rPr>
+              <w:t>Conclusion</w:t>
+            </w:r>
+            <w:r>
+              <w:rPr>
+                <w:noProof/>
+                <w:webHidden/>
+              </w:rPr>
+              <w:tab/>
+            </w:r>
+            <w:r>
+              <w:rPr>
+                <w:noProof/>
+                <w:webHidden/>
+              </w:rPr>
+              <w:fldChar w:fldCharType="begin"/>
+            </w:r>
+            <w:r>
+              <w:rPr>
+                <w:noProof/>
+                <w:webHidden/>
+              </w:rPr>
+              <w:instrText xml:space="preserve"> PAGEREF _Toc222991512 \h </w:instrText>
+            </w:r>
+            <w:r>
+              <w:rPr>
+                <w:noProof/>
+                <w:webHidden/>
+              </w:rPr>
+            </w:r>
+            <w:r>
+              <w:rPr>
+                <w:noProof/>
+                <w:webHidden/>
+              </w:rPr>
+              <w:fldChar w:fldCharType="separate"/>
+            </w:r>
+            <w:r>
+              <w:rPr>
+                <w:noProof/>
+                <w:webHidden/>
+              </w:rPr>
+              <w:t>3</w:t>
+            </w:r>
+            <w:r>
+              <w:rPr>
+                <w:noProof/>
+                <w:webHidden/>
+              </w:rPr>
+              <w:fldChar w:fldCharType="end"/>
+            </w:r>
+          </w:hyperlink>
+        </w:p>
+        <w:p>
+          <w:pPr>
+            <w:pStyle w:val="TOC1"/>
+            <w:tabs>
+              <w:tab w:val="right" w:leader="dot" w:pos="9016"/>
+            </w:tabs>
+            <w:rPr>
+              <w:noProof/>
+            </w:rPr>
+          </w:pPr>
+          <w:hyperlink w:anchor="_Toc222991513" w:history="1">
+            <w:r>
+              <w:rPr>
+                <w:rStyle w:val="Hyperlink"/>
+                <w:noProof/>
+              </w:rPr>
+              <w:t>References</w:t>
+            </w:r>
+            <w:r>
+              <w:rPr>
+                <w:noProof/>
+                <w:webHidden/>
+              </w:rPr>
+              <w:tab/>
+            </w:r>
+            <w:r>
+              <w:rPr>
+                <w:noProof/>
+                <w:webHidden/>
+              </w:rPr>
+              <w:fldChar w:fldCharType="begin"/>
+            </w:r>
+            <w:r>
+              <w:rPr>
+                <w:noProof/>
+                <w:webHidden/>
+              </w:rPr>
+              <w:instrText xml:space="preserve"> PAGEREF _Toc222991513 \h </w:instrText>
+            </w:r>
+            <w:r>
+              <w:rPr>
+                <w:noProof/>
+                <w:webHidden/>
+              </w:rPr>
+            </w:r>
+            <w:r>
+              <w:rPr>
+                <w:noProof/>
+                <w:webHidden/>
+              </w:rPr>
+              <w:fldChar w:fldCharType="separate"/>
+            </w:r>
+            <w:r>
+              <w:rPr>
+                <w:noProof/>
+                <w:webHidden/>
+              </w:rPr>
+              <w:t>4</w:t>
+            </w:r>
+            <w:r>
+              <w:rPr>
+                <w:noProof/>
+                <w:webHidden/>
+              </w:rPr>
+              <w:fldChar w:fldCharType="end"/>
+            </w:r>
+          </w:hyperlink>
+        </w:p>
+        <w:p>
+          <w:pPr>
+            <w:pStyle w:val="TOC1"/>
+            <w:tabs>
+              <w:tab w:val="right" w:leader="dot" w:pos="9016"/>
+            </w:tabs>
+            <w:rPr>
+              <w:noProof/>
+            </w:rPr>
+          </w:pPr>
+          <w:hyperlink w:anchor="_Toc222991514" w:history="1">
+            <w:r>
+              <w:rPr>
+                <w:rStyle w:val="Hyperlink"/>
+                <w:noProof/>
+              </w:rPr>
+              <w:t>Appendix</w:t>
+            </w:r>
+            <w:r>
+              <w:rPr>
+                <w:noProof/>
+                <w:webHidden/>
+              </w:rPr>
+              <w:tab/>
+            </w:r>
+            <w:r>
+              <w:rPr>
+                <w:noProof/>
+                <w:webHidden/>
+              </w:rPr>
+              <w:fldChar w:fldCharType="begin"/>
+            </w:r>
+            <w:r>
+              <w:rPr>
+                <w:noProof/>
+                <w:webHidden/>
+              </w:rPr>
+              <w:instrText xml:space="preserve"> PAGEREF _Toc222991514 \h </w:instrText>
+            </w:r>
+            <w:r>
+              <w:rPr>
+                <w:noProof/>
+                <w:webHidden/>
+              </w:rPr>
+            </w:r>
+            <w:r>
+              <w:rPr>
+                <w:noProof/>
+                <w:webHidden/>
+              </w:rPr>
+              <w:fldChar w:fldCharType="separate"/>
+            </w:r>
+            <w:r>
+              <w:rPr>
+                <w:noProof/>
+                <w:webHidden/>
+              </w:rPr>
+              <w:t>5</w:t>
+            </w:r>
+            <w:r>
+              <w:rPr>
+                <w:noProof/>
+                <w:webHidden/>
+              </w:rPr>
+              <w:fldChar w:fldCharType="end"/>
+            </w:r>
+          </w:hyperlink>
+        </w:p>
+        <w:p>
+          <w:r>
+            <w:rPr>
+              <w:b/>
+              <w:bCs/>
+              <w:noProof/>
+            </w:rPr>
+            <w:fldChar w:fldCharType="end"/>
+          </w:r>
+        </w:p>
+      </w:sdtContent>
+    </w:sdt>
     <w:p>
       <w:pPr>
         <w:pStyle w:val="Heading1"/>
       </w:pPr>
+      <w:bookmarkStart w:id="0" w:name="_Toc222991508"/>
       <w:r>
         <w:t>Introduction</w:t>
       </w:r>
+      <w:bookmarkEnd w:id="0"/>
       <w:r>
         <w:t xml:space="preserve"> </w:t>
       </w:r>
@@ -93,16 +1048,36 @@
         <w:t xml:space="preserve">) </w:t>
       </w:r>
       <w:r>
-        <w:t>and apply these risks to the University of Cambridge. A passive OSINT investigation will then map out the University’s online presence and identify key security risks without using any active scanning methods.</w:t>
+        <w:t xml:space="preserve">and </w:t>
+      </w:r>
+      <w:r>
+        <w:t>contextualize these risks specifically for the University of Cambridge.</w:t>
+      </w:r>
+      <w:r>
+        <w:t xml:space="preserve"> </w:t>
+      </w:r>
+      <w:r>
+        <w:t>Through a passive OSINT investigation, we have mapped your digital footprint to identify key security vulnerabilities without u</w:t>
+      </w:r>
+      <w:r>
+        <w:t>sing</w:t>
+      </w:r>
+      <w:r>
+        <w:t xml:space="preserve"> any active scanning methods against your infrastructure</w:t>
+      </w:r>
+      <w:r>
+        <w:t>.</w:t>
       </w:r>
     </w:p>
     <w:p>
       <w:pPr>
         <w:pStyle w:val="Heading1"/>
       </w:pPr>
+      <w:bookmarkStart w:id="1" w:name="_Toc222991509"/>
       <w:r>
         <w:t>Cyber Threat Intelligence</w:t>
       </w:r>
+      <w:bookmarkEnd w:id="1"/>
       <w:r>
         <w:t xml:space="preserve"> </w:t>
       </w:r>
@@ -188,7 +1163,11 @@
         <w:t>[3]</w:t>
       </w:r>
       <w:r>
-        <w:t>. These precedents underscore the specific risk to UK equivalents like Cambridge, confirming that research-intensive universities are prime targets for data exfiltration.</w:t>
+        <w:t xml:space="preserve">. These </w:t>
+      </w:r>
+      <w:r>
+        <w:lastRenderedPageBreak/>
+        <w:t>precedents underscore the specific risk to UK equivalents like Cambridge, confirming that research-intensive universities are prime targets for data exfiltration.</w:t>
       </w:r>
     </w:p>
     <w:p>
@@ -261,11 +1240,7 @@
         <w:t>[8]</w:t>
       </w:r>
       <w:r>
-        <w:t xml:space="preserve">. Instead of </w:t>
-      </w:r>
-      <w:r>
-        <w:lastRenderedPageBreak/>
-        <w:t xml:space="preserve">developing this technology themselves, these actors try to steal data directly from university servers to bypass international trade laws </w:t>
+        <w:t xml:space="preserve">. Instead of developing this technology themselves, these actors try to steal data directly from university servers to bypass international trade laws </w:t>
       </w:r>
       <w:r>
         <w:rPr>
@@ -282,151 +1257,191 @@
       <w:pPr>
         <w:pStyle w:val="Heading1"/>
       </w:pPr>
+      <w:bookmarkStart w:id="2" w:name="_Toc222991510"/>
       <w:r>
         <w:t>OSINT Analysis</w:t>
       </w:r>
+      <w:bookmarkEnd w:id="2"/>
       <w:r>
         <w:t xml:space="preserve"> </w:t>
       </w:r>
     </w:p>
     <w:p>
       <w:r>
-        <w:t>This investigation strictly employed passive reconnaissance techniques to map the University of Cambridge’s digital footprint. The goal was to identify public exposures that a Threat Actor (such as the groups identified in the sector analysis) could exploit, without engaging the University's infrastructure directly. The analysis followed the "Cyber Kill Chain" reconnaissance phase: gathering intelligence, mapping the network, and identifying potential entry points.</w:t>
-      </w:r>
-    </w:p>
-    <w:p>
-      <w:r>
-        <w:t>Initial intelligence gathering utilized Google Advanced Search operators to uncover sensitive directories (site:cam.ac.uk). While standard filetype queries returned vast amounts of benign academic data, refining the search to administrative keywords (</w:t>
-      </w:r>
-      <w:proofErr w:type="spellStart"/>
-      <w:r>
-        <w:t>filetype:pdf</w:t>
-      </w:r>
-      <w:proofErr w:type="spellEnd"/>
-      <w:r>
-        <w:t xml:space="preserve"> "admin" "guide") successfully exposed the internal "Equipment Sharing Database User Guide" </w:t>
-      </w:r>
-      <w:r>
-        <w:rPr>
-          <w:b/>
-          <w:bCs/>
-        </w:rPr>
-        <w:t>[A]</w:t>
+        <w:t xml:space="preserve">This investigation strictly employed passive reconnaissance techniques to map </w:t>
+      </w:r>
+      <w:r>
+        <w:t>your</w:t>
+      </w:r>
+      <w:r>
+        <w:t xml:space="preserve"> digital footprint. The </w:t>
+      </w:r>
+      <w:r>
+        <w:t>objective</w:t>
+      </w:r>
+      <w:r>
+        <w:t xml:space="preserve"> was to identify public exposures that a Threat Actor exploit, without </w:t>
+      </w:r>
+      <w:r>
+        <w:t xml:space="preserve">directly </w:t>
+      </w:r>
+      <w:r>
+        <w:t>engaging</w:t>
+      </w:r>
+      <w:r>
+        <w:t xml:space="preserve"> or scanning your infrastructure</w:t>
+      </w:r>
+      <w:r>
+        <w:t>. Th</w:t>
+      </w:r>
+      <w:r>
+        <w:t xml:space="preserve">is </w:t>
+      </w:r>
+      <w:r>
+        <w:t>analysis followed the Cyber Kill Chain reconnaissance phase: gathering intelligence, mapping the network, and identifying potential entry points.</w:t>
+      </w:r>
+    </w:p>
+    <w:p>
+      <w:r>
+        <w:t xml:space="preserve">Using Google Advanced Search operators, we aimed to uncover sensitive directories (site:cam.ac.uk). While standard filetype queries returned vast amounts of benign academic data, refining the search to administrative keywords (filetype:pdf "admin" "guide") successfully exposed your internal "Equipment Sharing Database User Guide" </w:t>
+      </w:r>
+      <w:r>
+        <w:rPr>
+          <w:b/>
+          <w:bCs/>
+        </w:rPr>
+        <w:t>[A].</w:t>
+      </w:r>
+    </w:p>
+    <w:p>
+      <w:r>
+        <w:t>While the document itself is not classified, it provides a "blueprint" for an attacker. It explicitly details user roles, internal terminology, and confirms the University’s reliance on "Raven" for Single Sign-On (SSO)</w:t>
+      </w:r>
+      <w:r>
+        <w:t xml:space="preserve"> </w:t>
+      </w:r>
+      <w:r>
+        <w:rPr>
+          <w:b/>
+          <w:bCs/>
+        </w:rPr>
+        <w:t>[6]</w:t>
+      </w:r>
+      <w:r>
+        <w:t xml:space="preserve">. For a cybercriminal, this is valuable context; knowing exactly how the internal systems are named and structured </w:t>
+      </w:r>
+      <w:r>
+        <w:t>allows them to craft highly authentic and convincing spear-phishing emails targeting your staff.</w:t>
+      </w:r>
+      <w:r>
+        <w:rPr>
+          <w:b/>
+          <w:bCs/>
+        </w:rPr>
+        <w:t xml:space="preserve"> </w:t>
+      </w:r>
+    </w:p>
+    <w:p>
+      <w:r>
+        <w:t>To understand your underlying web technologies</w:t>
+      </w:r>
+      <w:r>
+        <w:t xml:space="preserve">, Shodan.io was used to profile </w:t>
+      </w:r>
+      <w:r>
+        <w:t>your</w:t>
+      </w:r>
+      <w:r>
+        <w:t xml:space="preserve"> servers. The analysis revealed a significant migration to third-party cloud providers, with many services hosted on Google Cloud Platform (GCP) and Amazon Web Services (AWS). </w:t>
+      </w:r>
+    </w:p>
+    <w:p>
+      <w:r>
+        <w:t xml:space="preserve">Crucially, the query identified multiple subdomains labelled webapp.devel. These potential non-production environments are a frequent source of risk, as they </w:t>
+      </w:r>
+      <w:r>
+        <w:t xml:space="preserve">historically </w:t>
+      </w:r>
+      <w:r>
+        <w:t>lack the rigorous security patching applied to live sites</w:t>
+      </w:r>
+      <w:r>
+        <w:t>, production sites</w:t>
+      </w:r>
+      <w:r>
+        <w:t>. Furthermore, while cloud infrastructure is highly resilient, rapid deployments and migrations frequently lead to misconfigured storage assets. For a threat actor conducting passive reconnaissance, identifying misconfigured, publicly accessible AWS S3 buckets or GCP Storage blobs tied to these development subdomains represents a critical vulnerability</w:t>
+      </w:r>
+      <w:r>
+        <w:t xml:space="preserve"> </w:t>
+      </w:r>
+      <w:r>
+        <w:rPr>
+          <w:b/>
+          <w:bCs/>
+        </w:rPr>
+        <w:t>[B</w:t>
+      </w:r>
+      <w:r>
+        <w:rPr>
+          <w:b/>
+          <w:bCs/>
+        </w:rPr>
+        <w:t>]</w:t>
+      </w:r>
+      <w:r>
+        <w:t>.</w:t>
+      </w:r>
+    </w:p>
+    <w:p>
+      <w:r>
+        <w:t xml:space="preserve">Furthermore, passive header analysis detected Apache HTTP servers (v2.4.52/2.4.58) issuing mod_auth_openidc cookies </w:t>
+      </w:r>
+      <w:r>
+        <w:rPr>
+          <w:b/>
+          <w:bCs/>
+        </w:rPr>
+        <w:t>[ C].</w:t>
+      </w:r>
+      <w:r>
+        <w:t xml:space="preserve"> </w:t>
+      </w:r>
+      <w:r>
+        <w:t>This confirms your use of the OpenID Connect protocol for your central login system. While efficient, this creates a high-stakes security model: because one Identity Provider handles logins for numerous university services, the compromise of this single system would yield catastrophic, university-wide access for an attacker.</w:t>
+      </w:r>
+    </w:p>
+    <w:p>
+      <w:r>
+        <w:t xml:space="preserve">A </w:t>
+      </w:r>
+      <w:r>
+        <w:t xml:space="preserve">Censys query returned over 58,000 results, indicating a massive digital footprint </w:t>
+      </w:r>
+      <w:r>
+        <w:rPr>
+          <w:b/>
+          <w:bCs/>
+        </w:rPr>
+        <w:t>[D</w:t>
+      </w:r>
+      <w:r>
+        <w:rPr>
+          <w:b/>
+          <w:bCs/>
+        </w:rPr>
+        <w:t>]</w:t>
       </w:r>
       <w:r>
         <w:t xml:space="preserve">. </w:t>
       </w:r>
-    </w:p>
-    <w:p>
-      <w:r>
-        <w:t>While the document itself is not classified, it provides a "blueprint" for an attacker. It explicitly details user roles, internal terminology, and confirms the University’s reliance on "Raven" for Single Sign-On (SSO). For a cybercriminal, this is valuable context; knowing exactly how the internal systems are named and structured makes phishing emails look significantly more authentic and convincing to staff.</w:t>
-      </w:r>
-      <w:r>
-        <w:t xml:space="preserve"> </w:t>
-      </w:r>
-      <w:r>
-        <w:rPr>
-          <w:b/>
-          <w:bCs/>
-        </w:rPr>
-        <w:t>[6].</w:t>
-      </w:r>
-    </w:p>
-    <w:p>
-      <w:r>
-        <w:t>To understand the technology running the University's website, Shodan.io was used to profile the servers. The analysis revealed a significant migration to third-party cloud providers, with many services hosted on Google Cloud Platform (GCP) and Amazon Web Services (AWS).</w:t>
-      </w:r>
-    </w:p>
-    <w:p>
-      <w:r>
-        <w:t xml:space="preserve">Crucially, the query identified multiple subdomains </w:t>
-      </w:r>
-      <w:r>
-        <w:t>labelled</w:t>
-      </w:r>
-      <w:r>
-        <w:t xml:space="preserve"> </w:t>
-      </w:r>
-      <w:proofErr w:type="spellStart"/>
-      <w:r>
-        <w:t>webapp.devel</w:t>
-      </w:r>
-      <w:proofErr w:type="spellEnd"/>
-      <w:r>
-        <w:t xml:space="preserve">. These </w:t>
-      </w:r>
-      <w:r>
-        <w:t xml:space="preserve">potential </w:t>
-      </w:r>
-      <w:r>
-        <w:t xml:space="preserve">non-production environments are a frequent source of risk, as they often lack the rigorous security patching applied to live sites. Furthermore, passive header analysis detected Apache HTTP servers (v2.4.52/2.4.58) issuing </w:t>
-      </w:r>
-      <w:proofErr w:type="spellStart"/>
-      <w:r>
-        <w:t>mod_auth_openidc</w:t>
-      </w:r>
-      <w:proofErr w:type="spellEnd"/>
-      <w:r>
-        <w:t xml:space="preserve"> cookies </w:t>
-      </w:r>
-      <w:r>
-        <w:rPr>
-          <w:b/>
-          <w:bCs/>
-        </w:rPr>
-        <w:t>[B, C].</w:t>
-      </w:r>
-      <w:r>
-        <w:t xml:space="preserve"> </w:t>
-      </w:r>
-      <w:r>
-        <w:t>This technical detail confirms the University uses the OpenID Connect protocol for its central login system. This creates a high-stakes security model: because one "Identity Provider" handles logins for many different university services, a compromise of this single system would have a catastrophic, university-wide effect.</w:t>
-      </w:r>
-    </w:p>
-    <w:p>
-      <w:proofErr w:type="spellStart"/>
-      <w:r>
-        <w:t>Censys</w:t>
-      </w:r>
-      <w:proofErr w:type="spellEnd"/>
-      <w:r>
-        <w:t xml:space="preserve"> query returned over 58,000 results, indicating a massive digital footprint </w:t>
-      </w:r>
-      <w:r>
-        <w:rPr>
-          <w:b/>
-          <w:bCs/>
-        </w:rPr>
-        <w:t>[D</w:t>
-      </w:r>
-      <w:r>
-        <w:rPr>
-          <w:b/>
-          <w:bCs/>
-        </w:rPr>
-        <w:t>]</w:t>
-      </w:r>
-      <w:r>
-        <w:t xml:space="preserve">. </w:t>
-      </w:r>
-      <w:r>
-        <w:t>Automated tools (</w:t>
-      </w:r>
-      <w:proofErr w:type="spellStart"/>
-      <w:r>
-        <w:t>theHarvester</w:t>
-      </w:r>
-      <w:proofErr w:type="spellEnd"/>
-      <w:r>
-        <w:t xml:space="preserve"> and </w:t>
-      </w:r>
-      <w:proofErr w:type="spellStart"/>
-      <w:r>
-        <w:t>DNSdumpster</w:t>
-      </w:r>
-      <w:proofErr w:type="spellEnd"/>
-      <w:r>
-        <w:t>) were used to map out the "subdomains" that sit beneath the main university website. Two specific areas of risk were identified:</w:t>
+      <w:r>
+        <w:t xml:space="preserve">Automated tools (theHarvester and DNSdumpster) were used to map out the subdomains that sit beneath </w:t>
+      </w:r>
+      <w:r>
+        <w:t>your</w:t>
+      </w:r>
+      <w:r>
+        <w:t xml:space="preserve"> main university website. Two specific areas of risk were identified:</w:t>
       </w:r>
     </w:p>
     <w:p>
@@ -438,31 +1453,28 @@
         </w:numPr>
       </w:pPr>
       <w:r>
-        <w:t xml:space="preserve">Administrative Interfaces: The tool identified the subdomain hive.em.admin.cam.ac.uk </w:t>
-      </w:r>
-      <w:r>
-        <w:rPr>
-          <w:b/>
-          <w:bCs/>
-        </w:rPr>
-        <w:t>[</w:t>
-      </w:r>
-      <w:r>
-        <w:rPr>
-          <w:b/>
-          <w:bCs/>
-        </w:rPr>
-        <w:t>E</w:t>
-      </w:r>
-      <w:r>
-        <w:rPr>
-          <w:b/>
-          <w:bCs/>
-        </w:rPr>
-        <w:t>]</w:t>
-      </w:r>
-      <w:r>
-        <w:t>. The terms "Admin" and "EM" suggest this is a backend interface used by staff, not students. If this login page is exposed to the open internet, it presents a high-value target for credential theft attacks.</w:t>
+        <w:rPr>
+          <w:b/>
+          <w:bCs/>
+        </w:rPr>
+        <w:lastRenderedPageBreak/>
+        <w:t>Administrative Interfaces:</w:t>
+      </w:r>
+      <w:r>
+        <w:t xml:space="preserve"> </w:t>
+      </w:r>
+      <w:r>
+        <w:t>Subdomains like hive.em.admin.cam.ac.uk suggest backend staff interfaces. If exposed publicly, these are high-value targets for credential theft.</w:t>
+      </w:r>
+      <w:r>
+        <w:t xml:space="preserve"> </w:t>
+      </w:r>
+      <w:r>
+        <w:rPr>
+          <w:b/>
+          <w:bCs/>
+        </w:rPr>
+        <w:t>[E]</w:t>
       </w:r>
     </w:p>
     <w:p>
@@ -474,25 +1486,14 @@
         </w:numPr>
       </w:pPr>
       <w:r>
-        <w:t>Development Environments</w:t>
-      </w:r>
-      <w:r>
-        <w:rPr>
-          <w:b/>
-          <w:bCs/>
-        </w:rPr>
-        <w:t>:</w:t>
-      </w:r>
-      <w:r>
-        <w:t xml:space="preserve"> The network map highlighted subdomains containing "dev" and "</w:t>
-      </w:r>
-      <w:proofErr w:type="spellStart"/>
-      <w:r>
-        <w:t>api</w:t>
-      </w:r>
-      <w:proofErr w:type="spellEnd"/>
-      <w:r>
-        <w:t xml:space="preserve">," such as api-dev-amicus.admin.cam.ac.uk </w:t>
+        <w:rPr>
+          <w:b/>
+          <w:bCs/>
+        </w:rPr>
+        <w:t>Development Environments:</w:t>
+      </w:r>
+      <w:r>
+        <w:t xml:space="preserve"> The network map highlighted subdomains containing "dev" and "api," such as api-dev-amicus.admin.cam.ac.uk </w:t>
       </w:r>
       <w:r>
         <w:rPr>
@@ -521,15 +1522,7 @@
     </w:p>
     <w:p>
       <w:r>
-        <w:t>A "</w:t>
-      </w:r>
-      <w:proofErr w:type="spellStart"/>
-      <w:r>
-        <w:t>Whois</w:t>
-      </w:r>
-      <w:proofErr w:type="spellEnd"/>
-      <w:r>
-        <w:t xml:space="preserve">" query was conducted to identify domain ownership. The contact details were redacted, meaning the University successfully uses a privacy service to hide administrator names from the public </w:t>
+        <w:t xml:space="preserve">A "Whois" query confirmed you successfully utilize a privacy service to redact administrator contact details </w:t>
       </w:r>
       <w:r>
         <w:rPr>
@@ -539,33 +1532,16 @@
         <w:t>[F]</w:t>
       </w:r>
       <w:r>
-        <w:t xml:space="preserve">. This is a positive security control, as it prevents attackers from easily finding specific IT </w:t>
-      </w:r>
-      <w:r>
-        <w:lastRenderedPageBreak/>
-        <w:t>staff to target with social engineering. The records confirmed the University’s connection to the JANET network, linking it to the wider UK academic infrastructure.</w:t>
-      </w:r>
-    </w:p>
-    <w:p>
-      <w:r>
-        <w:t>Fi</w:t>
-      </w:r>
-      <w:r>
-        <w:t xml:space="preserve">nally, </w:t>
-      </w:r>
-      <w:proofErr w:type="spellStart"/>
-      <w:r>
-        <w:t>nslookup</w:t>
-      </w:r>
-      <w:proofErr w:type="spellEnd"/>
-      <w:r>
-        <w:t xml:space="preserve"> was used to </w:t>
-      </w:r>
-      <w:r>
-        <w:t>analyse</w:t>
-      </w:r>
-      <w:r>
-        <w:t xml:space="preserve"> the network addressing. The results confirmed a "dual-stack" configuration, meaning the University is accessible via both standard (IPv4) and modern (IPv6) addresses </w:t>
+        <w:t>. This is a strong positive security control, preventing attackers from easily scraping specific IT staff names for social engineering campaigns. The records also confirmed your connection to the JANET network.</w:t>
+      </w:r>
+      <w:r>
+        <w:t>, linking it to the wider UK academic infrastructure.</w:t>
+      </w:r>
+      <w:bookmarkStart w:id="3" w:name="_Toc222991511"/>
+    </w:p>
+    <w:p>
+      <w:r>
+        <w:t xml:space="preserve">Finally, nslookup analysis confirmed a "dual-stack" configuration, making you accessible via both legacy (IPv4) and modern (IPv6) addresses </w:t>
       </w:r>
       <w:r>
         <w:rPr>
@@ -575,7 +1551,7 @@
         <w:t>[G]</w:t>
       </w:r>
       <w:r>
-        <w:t>. While necessary for connectivity, this effectively doubles the attack surface. Security controls are often less mature on IPv6 infrastructure; if the University has configured strong firewalls for IPv4 but overlooked the IPv6 ranges, these newer addresses could serve as an obscured entry point for the attacks described in the sector analysis.</w:t>
+        <w:t>. While necessary for modern connectivity, this effectively doubles your attack surface. If your security teams have configured robust firewalls for IPv4 but lack equal maturity and visibility over IPv6 ranges, these newer addresses could serve as an obscured entry point for the attacks described in the threat intelligence sector analysis.</w:t>
       </w:r>
     </w:p>
     <w:p>
@@ -588,79 +1564,38 @@
       <w:r>
         <w:t>Discussion</w:t>
       </w:r>
+      <w:bookmarkEnd w:id="3"/>
       <w:r>
         <w:t xml:space="preserve"> </w:t>
       </w:r>
     </w:p>
     <w:p>
       <w:r>
-        <w:t xml:space="preserve">The correlation between the sector-wide threat intelligence and the specific OSINT findings reveals a critical vulnerability in the University’s security posture. The University relies on the "Raven" Single Sign-On (SSO) system. While SSO improves user experience, it creates a single point of failure; if a threat actor successfully spear-phishes a single administrator credential, they bypass the perimeter entirely. The presence of </w:t>
-      </w:r>
-      <w:proofErr w:type="spellStart"/>
-      <w:r>
-        <w:t>mod_auth_openidc</w:t>
-      </w:r>
-      <w:proofErr w:type="spellEnd"/>
-      <w:r>
-        <w:t xml:space="preserve"> cookies confirms that this one key unlocks multiple doors, potentially granting access to sensitive internal data without further authentication.</w:t>
-      </w:r>
-    </w:p>
-    <w:p>
-      <w:r>
-        <w:t>While this technical analysis focused on infrastructure, a comprehensive threat actor would likely pivot to social media reconnaissance (LinkedIn) to identify specific Raven users. Targeting these individuals with phishing emails</w:t>
-      </w:r>
+        <w:t>The correlation between sector-wide threat intelligence and the specific OSINT findings reveals a critical vulnerability in your security posture. Your reliance on the "Raven" SSO system creates a single point of failure. If a threat actor successfully spear-phishes a single administrator credential, they bypass your perimeter entirely.</w:t>
+      </w:r>
+    </w:p>
+    <w:p>
       <w:r>
         <w:t xml:space="preserve"> </w:t>
       </w:r>
       <w:r>
-        <w:t>remains the most probable path for credential theft.</w:t>
-      </w:r>
-    </w:p>
-    <w:p>
-      <w:r>
-        <w:t xml:space="preserve">However, the </w:t>
-      </w:r>
-      <w:proofErr w:type="spellStart"/>
-      <w:r>
-        <w:t>Whois</w:t>
-      </w:r>
-      <w:proofErr w:type="spellEnd"/>
-      <w:r>
-        <w:t xml:space="preserve"> analysis demonstrates a robust defence against specific types of social engineering. By utilising privacy redaction services to mask administrator contact details, the University successfully breaks the "Reconnaissance" phase of the Cyber Kill Chain. This obfuscation forces attackers to rely on broader, less effective phishing campaigns rather than attacks targeting specific high-privilege IT staff. This suggests the University has prioritised protecting its personnel, even if the technical documentation remains exposed.</w:t>
-      </w:r>
-    </w:p>
-    <w:p>
-      <w:r>
-        <w:t>Furthermore, the infrastructure analysis highlights the risk of development subdomains. This gives an attacker two choices: brute-force the hardened Raven login or try to slip through the development API. The CTI data suggests that financially motivated groups would likely exploit the API to deploy payloads, whereas state-sponsored actors would target the administrative system via Raven for persistent access.</w:t>
-      </w:r>
-    </w:p>
-    <w:p>
-      <w:r>
-        <w:t xml:space="preserve">Finally, the IPv4/IPv6 configuration identified via </w:t>
-      </w:r>
-      <w:proofErr w:type="spellStart"/>
-      <w:r>
-        <w:t>nslookup</w:t>
-      </w:r>
-      <w:proofErr w:type="spellEnd"/>
-      <w:r>
-        <w:t xml:space="preserve"> creates a dangerous opening. When legacy security tools fail to monitor IPv6, they provide "blind spots" for command-and-control (C2) traffic to operate undetected. This lack of visibility is precisely why </w:t>
-      </w:r>
-      <w:r>
-        <w:t>30% of institutions now report</w:t>
-      </w:r>
-      <w:r>
-        <w:rPr>
-          <w:b/>
-          <w:bCs/>
-        </w:rPr>
-        <w:t xml:space="preserve"> </w:t>
-      </w:r>
-      <w:r>
-        <w:t>successful weekly attacks</w:t>
-      </w:r>
-      <w:r>
-        <w:t>; by providing a hidden path for exfiltration, these unmonitored edges allow automated scans to transition into persistent, high-frequency security breaches.</w:t>
+        <w:t>Furthermore, your ongoing migration to AWS and GCP introduces the severe risk of data exposure through misconfigured cloud storage. If an S3 bucket is left public during the development of your webapp.devel subdomains, threat actors could passively scrape sensitive institutional data or internal credentials without ever needing to breach the Raven SSO perimeter.</w:t>
+      </w:r>
+    </w:p>
+    <w:p>
+      <w:r>
+        <w:t>While this technical analysis focused on infrastructure, a comprehensive threat actor would likely pivot to social media reconnaissance (e.g., LinkedIn) to identify specific Raven users. Targeting these individuals with phishing emails remains the most probable path for credential theft. Fortunately, your Whois privacy redaction successfully breaks the "Reconnaissance" phase of the Cyber Kill Chain by masking administrator details. This obfuscation forces attackers to rely on broader, less effective phishing campaigns rather than targeting specific high-privilege IT staff.</w:t>
+      </w:r>
+    </w:p>
+    <w:p>
+      <w:r>
+        <w:t>However, the infrastructure analysis highlights the persistent risk of your development subdomains. This affords an attacker two distinct avenues: brute-force the hardened Raven login, or attempt to slip through a less-secure development API. Current CTI data suggests financially motivated groups will likely exploit the API to deploy payloads (like ransomware), whereas state-sponsored actors will target the administrative system via Raven to establish long-term, persistent access.</w:t>
+      </w:r>
+      <w:bookmarkStart w:id="4" w:name="_Toc222991512"/>
+    </w:p>
+    <w:p>
+      <w:r>
+        <w:t>Finally, your IPv4/IPv6 configuration creates a dangerous potential opening. When legacy security tools fail to monitor IPv6 traffic, they provide blind spots for Command-and-Control (C2) traffic to operate undetected. This lack of visibility is a primary reason why 30% of HE institutions now report successful weekly attacks; unmonitored edges allow automated scanning to easily transition into persistent security breaches.</w:t>
       </w:r>
     </w:p>
     <w:p>
@@ -668,21 +1603,49 @@
         <w:pStyle w:val="Heading1"/>
       </w:pPr>
       <w:r>
+        <w:lastRenderedPageBreak/>
         <w:t>Conclusion</w:t>
       </w:r>
+      <w:bookmarkEnd w:id="4"/>
       <w:r>
         <w:t xml:space="preserve"> </w:t>
       </w:r>
     </w:p>
     <w:p>
       <w:r>
-        <w:t>This report confirms that the UK Higher Education sector faces a severe and evolving threat landscape, dominated by credential theft (97%) and ransomware. The OSINT investigation of the University of Cambridge reveals a security posture that is strong in administrative privacy but fragile in its expanding technical attack surface.</w:t>
-      </w:r>
-    </w:p>
-    <w:p>
-      <w:r>
-        <w:lastRenderedPageBreak/>
-        <w:t>The University’s reliance on the "Raven" Single Sign-On system creates a critical dependency: a single compromised credential could grant wide-ranging access to sensitive internal data. Furthermore, the discovery of unmonitored development subdomains and API endpoints exposes a "Shadow IT" risk that bypasses traditional perimeter defences. To mitigate these risks, the University must prioritize securing its cloud environments and ensuring that non-production assets are subject to the same rigorous monitoring as live systems.</w:t>
+        <w:t>This report confirms that the UK Higher Education sector, and the University of Cambridge specifically, faces a severe and evolving threat landscape dominated by credential theft (97%) and ransomware. This OSINT investigation reveals that your security posture is strong regarding administrative privacy, but fragile regarding your rapidly expanding technical attack surface.</w:t>
+      </w:r>
+    </w:p>
+    <w:p>
+      <w:r>
+        <w:t xml:space="preserve">Your reliance on the Raven SSO system creates a critical dependency: a single compromised credential could grant wide-ranging access to highly sensitive internal data. Furthermore, the discovery of development subdomains and API endpoints exposes a "Shadow IT" risk that inherently bypasses traditional perimeter </w:t>
+      </w:r>
+      <w:r>
+        <w:t>defences</w:t>
+      </w:r>
+      <w:r>
+        <w:t>.</w:t>
+      </w:r>
+    </w:p>
+    <w:p>
+      <w:pPr>
+        <w:pStyle w:val="Heading1"/>
+        <w:rPr>
+          <w:rFonts w:asciiTheme="minorHAnsi" w:eastAsiaTheme="minorHAnsi" w:hAnsiTheme="minorHAnsi" w:cstheme="minorBidi"/>
+          <w:color w:val="auto"/>
+          <w:sz w:val="22"/>
+          <w:szCs w:val="22"/>
+        </w:rPr>
+      </w:pPr>
+      <w:bookmarkStart w:id="5" w:name="_Toc222991513"/>
+      <w:r>
+        <w:rPr>
+          <w:rFonts w:asciiTheme="minorHAnsi" w:eastAsiaTheme="minorHAnsi" w:hAnsiTheme="minorHAnsi" w:cstheme="minorBidi"/>
+          <w:color w:val="auto"/>
+          <w:sz w:val="22"/>
+          <w:szCs w:val="22"/>
+        </w:rPr>
+        <w:t>To remediate these vulnerabilities, we recommend you immediately audit your cloud environments (AWS/GCP) and ensure that all non-production and development assets are subjected to the exact same rigorous security monitoring, access controls, and patching schedules as your live systems.</w:t>
       </w:r>
     </w:p>
     <w:p>
@@ -692,6 +1655,7 @@
       <w:r>
         <w:t>References</w:t>
       </w:r>
+      <w:bookmarkEnd w:id="5"/>
     </w:p>
     <w:p>
       <w:pPr>
@@ -727,7 +1691,7 @@
         </w:rPr>
         <w:t xml:space="preserve">, 2025. [Online]. Available: </w:t>
       </w:r>
-      <w:hyperlink r:id="rId5" w:tgtFrame="_blank" w:history="1">
+      <w:hyperlink r:id="rId6" w:tgtFrame="_blank" w:history="1">
         <w:r>
           <w:rPr>
             <w:rStyle w:val="Hyperlink"/>
@@ -770,7 +1734,7 @@
       <w:r>
         <w:t xml:space="preserve">, 2025. [Online]. Available: </w:t>
       </w:r>
-      <w:hyperlink r:id="rId6" w:tgtFrame="_blank" w:history="1">
+      <w:hyperlink r:id="rId7" w:tgtFrame="_blank" w:history="1">
         <w:r>
           <w:rPr>
             <w:rStyle w:val="Hyperlink"/>
@@ -806,7 +1770,7 @@
       <w:r>
         <w:t xml:space="preserve">, vol. 638, 2025. [Online]. Available: </w:t>
       </w:r>
-      <w:hyperlink r:id="rId7" w:tgtFrame="_blank" w:history="1">
+      <w:hyperlink r:id="rId8" w:tgtFrame="_blank" w:history="1">
         <w:r>
           <w:rPr>
             <w:rStyle w:val="Hyperlink"/>
@@ -848,7 +1812,7 @@
       <w:r>
         <w:t xml:space="preserve">, 2024. [Online]. Available: </w:t>
       </w:r>
-      <w:hyperlink r:id="rId8" w:tgtFrame="_blank" w:history="1">
+      <w:hyperlink r:id="rId9" w:tgtFrame="_blank" w:history="1">
         <w:r>
           <w:rPr>
             <w:rStyle w:val="Hyperlink"/>
@@ -891,7 +1855,7 @@
       <w:r>
         <w:t xml:space="preserve">, 2024. [Online]. Available: </w:t>
       </w:r>
-      <w:hyperlink r:id="rId9" w:tgtFrame="_blank" w:history="1">
+      <w:hyperlink r:id="rId10" w:tgtFrame="_blank" w:history="1">
         <w:r>
           <w:rPr>
             <w:rStyle w:val="Hyperlink"/>
@@ -927,7 +1891,7 @@
       <w:r>
         <w:t xml:space="preserve">, n.d. [Online]. Available: </w:t>
       </w:r>
-      <w:hyperlink r:id="rId10" w:tgtFrame="_blank" w:history="1">
+      <w:hyperlink r:id="rId11" w:tgtFrame="_blank" w:history="1">
         <w:r>
           <w:rPr>
             <w:rStyle w:val="Hyperlink"/>
@@ -976,7 +1940,7 @@
       <w:r>
         <w:t xml:space="preserve">, 2025. [Online]. Available: </w:t>
       </w:r>
-      <w:hyperlink r:id="rId11" w:tgtFrame="_blank" w:history="1">
+      <w:hyperlink r:id="rId12" w:tgtFrame="_blank" w:history="1">
         <w:r>
           <w:rPr>
             <w:rStyle w:val="Hyperlink"/>
@@ -1025,7 +1989,7 @@
       <w:r>
         <w:t xml:space="preserve">, 2025. [Online]. Available: </w:t>
       </w:r>
-      <w:hyperlink r:id="rId12" w:tgtFrame="_blank" w:history="1">
+      <w:hyperlink r:id="rId13" w:tgtFrame="_blank" w:history="1">
         <w:r>
           <w:rPr>
             <w:rStyle w:val="Hyperlink"/>
@@ -1050,6 +2014,7 @@
           <w:b/>
           <w:bCs/>
         </w:rPr>
+        <w:lastRenderedPageBreak/>
         <w:t>[9]</w:t>
       </w:r>
       <w:r>
@@ -1068,7 +2033,7 @@
       <w:r>
         <w:t xml:space="preserve">, 2025. [Online]. Available: </w:t>
       </w:r>
-      <w:hyperlink r:id="rId13" w:tgtFrame="_blank" w:history="1">
+      <w:hyperlink r:id="rId14" w:tgtFrame="_blank" w:history="1">
         <w:r>
           <w:rPr>
             <w:rStyle w:val="Hyperlink"/>
@@ -1084,9 +2049,13 @@
       <w:pPr>
         <w:pStyle w:val="Heading1"/>
       </w:pPr>
-      <w:r>
-        <w:lastRenderedPageBreak/>
-        <w:t xml:space="preserve">Appendix </w:t>
+      <w:bookmarkStart w:id="6" w:name="_Toc222991514"/>
+      <w:r>
+        <w:t>Appendix</w:t>
+      </w:r>
+      <w:bookmarkEnd w:id="6"/>
+      <w:r>
+        <w:t xml:space="preserve"> </w:t>
       </w:r>
     </w:p>
     <w:p>
@@ -1110,7 +2079,7 @@
                     <pic:cNvPicPr/>
                   </pic:nvPicPr>
                   <pic:blipFill>
-                    <a:blip r:embed="rId14"/>
+                    <a:blip r:embed="rId15"/>
                     <a:stretch>
                       <a:fillRect/>
                     </a:stretch>
@@ -1181,7 +2150,7 @@
                     <pic:cNvPicPr/>
                   </pic:nvPicPr>
                   <pic:blipFill>
-                    <a:blip r:embed="rId15"/>
+                    <a:blip r:embed="rId16"/>
                     <a:stretch>
                       <a:fillRect/>
                     </a:stretch>
@@ -1260,7 +2229,7 @@
                     <pic:cNvPicPr/>
                   </pic:nvPicPr>
                   <pic:blipFill>
-                    <a:blip r:embed="rId16"/>
+                    <a:blip r:embed="rId17"/>
                     <a:stretch>
                       <a:fillRect/>
                     </a:stretch>
@@ -1338,7 +2307,7 @@
                     <pic:cNvPicPr/>
                   </pic:nvPicPr>
                   <pic:blipFill>
-                    <a:blip r:embed="rId17"/>
+                    <a:blip r:embed="rId18"/>
                     <a:stretch>
                       <a:fillRect/>
                     </a:stretch>
@@ -1424,7 +2393,7 @@
                     <pic:cNvPicPr/>
                   </pic:nvPicPr>
                   <pic:blipFill>
-                    <a:blip r:embed="rId18"/>
+                    <a:blip r:embed="rId19"/>
                     <a:stretch>
                       <a:fillRect/>
                     </a:stretch>
@@ -1502,7 +2471,7 @@
                     <pic:cNvPicPr/>
                   </pic:nvPicPr>
                   <pic:blipFill>
-                    <a:blip r:embed="rId19"/>
+                    <a:blip r:embed="rId20"/>
                     <a:stretch>
                       <a:fillRect/>
                     </a:stretch>
@@ -1581,7 +2550,7 @@
                     <pic:cNvPicPr/>
                   </pic:nvPicPr>
                   <pic:blipFill rotWithShape="1">
-                    <a:blip r:embed="rId20"/>
+                    <a:blip r:embed="rId21"/>
                     <a:srcRect t="10660"/>
                     <a:stretch>
                       <a:fillRect/>
@@ -1668,7 +2637,7 @@
                     <pic:cNvPicPr/>
                   </pic:nvPicPr>
                   <pic:blipFill>
-                    <a:blip r:embed="rId21"/>
+                    <a:blip r:embed="rId22"/>
                     <a:stretch>
                       <a:fillRect/>
                     </a:stretch>
@@ -1747,7 +2716,7 @@
                     <pic:cNvPicPr/>
                   </pic:nvPicPr>
                   <pic:blipFill>
-                    <a:blip r:embed="rId22"/>
+                    <a:blip r:embed="rId23"/>
                     <a:stretch>
                       <a:fillRect/>
                     </a:stretch>
@@ -3660,7 +4629,9 @@
     <w:sectPr>
       <w:pgSz w:w="11906" w:h="16838"/>
       <w:pgMar w:top="1440" w:right="1440" w:bottom="1440" w:left="1440" w:header="708" w:footer="708" w:gutter="0"/>
+      <w:pgNumType w:start="0"/>
       <w:cols w:space="708"/>
+      <w:titlePg/>
       <w:docGrid w:linePitch="360"/>
     </w:sectPr>
   </w:body>
@@ -4733,6 +5704,61 @@
       </w:tblBorders>
     </w:tblPr>
   </w:style>
+  <w:style w:type="paragraph" w:styleId="NoSpacing">
+    <w:name w:val="No Spacing"/>
+    <w:link w:val="NoSpacingChar"/>
+    <w:uiPriority w:val="1"/>
+    <w:qFormat/>
+    <w:rsid w:val="00022E91"/>
+    <w:pPr>
+      <w:spacing w:after="0" w:line="240" w:lineRule="auto"/>
+    </w:pPr>
+    <w:rPr>
+      <w:rFonts w:eastAsiaTheme="minorEastAsia"/>
+      <w:lang w:val="en-US"/>
+    </w:rPr>
+  </w:style>
+  <w:style w:type="character" w:customStyle="1" w:styleId="NoSpacingChar">
+    <w:name w:val="No Spacing Char"/>
+    <w:basedOn w:val="DefaultParagraphFont"/>
+    <w:link w:val="NoSpacing"/>
+    <w:uiPriority w:val="1"/>
+    <w:rsid w:val="00022E91"/>
+    <w:rPr>
+      <w:rFonts w:eastAsiaTheme="minorEastAsia"/>
+      <w:lang w:val="en-US"/>
+    </w:rPr>
+  </w:style>
+  <w:style w:type="paragraph" w:styleId="TOCHeading">
+    <w:name w:val="TOC Heading"/>
+    <w:basedOn w:val="Heading1"/>
+    <w:next w:val="Normal"/>
+    <w:uiPriority w:val="39"/>
+    <w:unhideWhenUsed/>
+    <w:qFormat/>
+    <w:rsid w:val="00022E91"/>
+    <w:pPr>
+      <w:spacing w:before="240" w:after="0"/>
+      <w:outlineLvl w:val="9"/>
+    </w:pPr>
+    <w:rPr>
+      <w:sz w:val="32"/>
+      <w:szCs w:val="32"/>
+      <w:lang w:val="en-US"/>
+    </w:rPr>
+  </w:style>
+  <w:style w:type="paragraph" w:styleId="TOC1">
+    <w:name w:val="toc 1"/>
+    <w:basedOn w:val="Normal"/>
+    <w:next w:val="Normal"/>
+    <w:autoRedefine/>
+    <w:uiPriority w:val="39"/>
+    <w:unhideWhenUsed/>
+    <w:rsid w:val="00022E91"/>
+    <w:pPr>
+      <w:spacing w:after="100"/>
+    </w:pPr>
+  </w:style>
 </w:styles>
 </file>
 
@@ -5029,4 +6055,16 @@
     </a:ext>
   </a:extLst>
 </a:theme>
+</file>
+
+<file path=customXml/item1.xml><?xml version="1.0" encoding="utf-8"?>
+<b:Sources xmlns:b="http://schemas.openxmlformats.org/officeDocument/2006/bibliography" xmlns="http://schemas.openxmlformats.org/officeDocument/2006/bibliography" SelectedStyle="\APASixthEditionOfficeOnline.xsl" StyleName="APA" Version="6"/>
+</file>
+
+<file path=customXml/itemProps1.xml><?xml version="1.0" encoding="utf-8"?>
+<ds:datastoreItem xmlns:ds="http://schemas.openxmlformats.org/officeDocument/2006/customXml" ds:itemID="{C7973129-DD48-4F1E-AB75-D354B3329F7A}">
+  <ds:schemaRefs>
+    <ds:schemaRef ds:uri="http://schemas.openxmlformats.org/officeDocument/2006/bibliography"/>
+  </ds:schemaRefs>
+</ds:datastoreItem>
 </file>
</xml_diff>